<commit_message>
Add ML anomaly detection in shadow mode: fisre-ml module, ML_SCORE template, ADR-0009
Unsupervised Isolation Forest per product, percentile score with top-3 feature
explanation, model registry with SHA-256 integrity, ML_ANOMALY rule shipped as
DRAFT so nothing reaches case management until promoted. Fails safe when scores
are missing. Spec coverage gate also reads the Python tests.

Co-Authored-By: Claude Sonnet 5.5 <noreply@anthropic.com>
Claude-Session: https://claude.ai/code/session_019LjVndnFas2Tz3xQUNn5U3
</commit_message>
<xml_diff>
--- a/docs/case-management-tech-spec.docx
+++ b/docs/case-management-tech-spec.docx
@@ -2841,6 +2841,65 @@
           </w:p>
         </w:tc>
       </w:tr>
+      <w:tr>
+        <w:tc>
+          <w:tcPr>
+            <w:tcW w:type="dxa" w:w="1728"/>
+          </w:tcPr>
+          <w:p>
+            <w:r>
+              <w:t>ML_ANOMALY</w:t>
+            </w:r>
+          </w:p>
+        </w:tc>
+        <w:tc>
+          <w:tcPr>
+            <w:tcW w:type="dxa" w:w="1728"/>
+          </w:tcPr>
+          <w:p>
+            <w:r>
+              <w:t>Any</w:t>
+            </w:r>
+          </w:p>
+        </w:tc>
+        <w:tc>
+          <w:tcPr>
+            <w:tcW w:type="dxa" w:w="1728"/>
+          </w:tcPr>
+          <w:p>
+            <w:r/>
+            <w:r>
+              <w:rPr>
+                <w:b/>
+              </w:rPr>
+              <w:t>Not live yet (shadow mode).</w:t>
+            </w:r>
+            <w:r>
+              <w:t xml:space="preserve"> Machine-learning anomaly score: the account's behaviour that day is unusual compared with peers of the same product</w:t>
+            </w:r>
+          </w:p>
+        </w:tc>
+        <w:tc>
+          <w:tcPr>
+            <w:tcW w:type="dxa" w:w="1728"/>
+          </w:tcPr>
+          <w:p>
+            <w:r>
+              <w:t>ML_SCORE</w:t>
+            </w:r>
+          </w:p>
+        </w:tc>
+        <w:tc>
+          <w:tcPr>
+            <w:tcW w:type="dxa" w:w="1728"/>
+          </w:tcPr>
+          <w:p>
+            <w:r>
+              <w:t>model, model_version, score, rank, top_features[{feature, value, peer_median, z}], min_score</w:t>
+            </w:r>
+          </w:p>
+        </w:tc>
+      </w:tr>
     </w:tbl>
     <w:p/>
     <w:p>
@@ -2850,7 +2909,12 @@
     </w:p>
     <w:p>
       <w:r>
-        <w:t xml:space="preserve">Samples for every rule: samples/alert-&lt;rule&gt;.json. </w:t>
+        <w:t>ML_ANOMALY will only appear in deliveries after Compliance approves going live (an announced change; see ADR-0009 in the engine repository). Its score is a percentile from 0 to 1 (0.995 = more unusual than 99.5% of training) and top_features is a heuristic explanation of *why to look*, not proof of wrongdoing; it is not a severity. Design for it now: ignore unknown evidence keys (CMR-ING-10) and show top_features to the analyst.</w:t>
+      </w:r>
+    </w:p>
+    <w:p>
+      <w:r>
+        <w:t xml:space="preserve">Samples for the nine live rules: samples/alert-&lt;rule&gt;.json. </w:t>
       </w:r>
       <w:r>
         <w:rPr>
@@ -6474,6 +6538,28 @@
           <w:p>
             <w:r>
               <w:t>Structuring (and, with context, money laundering)</w:t>
+            </w:r>
+          </w:p>
+        </w:tc>
+      </w:tr>
+      <w:tr>
+        <w:tc>
+          <w:tcPr>
+            <w:tcW w:type="dxa" w:w="4320"/>
+          </w:tcPr>
+          <w:p>
+            <w:r>
+              <w:t>ML_ANOMALY</w:t>
+            </w:r>
+          </w:p>
+        </w:tc>
+        <w:tc>
+          <w:tcPr>
+            <w:tcW w:type="dxa" w:w="4320"/>
+          </w:tcPr>
+          <w:p>
+            <w:r>
+              <w:t>No category suggestion: the analyst determines it from the investigation</w:t>
             </w:r>
           </w:p>
         </w:tc>

</xml_diff>